<commit_message>
Shorter, catchier title for the public-sector paper
Co-Authored-By: Claude Sonnet 5.5 <noreply@anthropic.com>
Claude-Session: https://claude.ai/code/session_01B6hBNJS5eMNFXmCvfzEnc8
</commit_message>
<xml_diff>
--- a/gov_paper/deliverables/Paper_PublicSector_Accounting.docx
+++ b/gov_paper/deliverables/Paper_PublicSector_Accounting.docx
@@ -17,7 +17,7 @@
           <w:szCs w:val="28"/>
           <w:lang w:val="en-US" w:bidi="fa-IR"/>
         </w:rPr>
-        <w:t xml:space="preserve">از انطباق نمادین تا اجرای ماهوی: نقش فشارهای نهادی و بلوغ نظام اطلاعاتی در اثرگذاری اصلاحات مالی بر پاسخگویی دستگاه‌های اجرایی</w:t>
+        <w:t xml:space="preserve">ظاهر یا ماهیت؟ فشارهای نهادی و پاسخگویی در اصلاحات مالی دستگاه‌های اجرایی</w:t>
       </w:r>
     </w:p>
     <w:p>
@@ -19726,7 +19726,7 @@
           <w:szCs w:val="24"/>
           <w:lang w:val="en-US" w:bidi="fa-IR"/>
         </w:rPr>
-        <w:t xml:space="preserve">From Symbolic Compliance to Substantive Implementation</w:t>
+        <w:t xml:space="preserve">Form or Substance</w:t>
       </w:r>
       <w:r>
         <w:rPr>
@@ -19739,7 +19739,7 @@
           <w:szCs w:val="28"/>
           <w:lang w:val="en-US" w:bidi="fa-IR"/>
         </w:rPr>
-        <w:t xml:space="preserve">: </w:t>
+        <w:t xml:space="preserve">? </w:t>
       </w:r>
       <w:r>
         <w:rPr>
@@ -19752,33 +19752,7 @@
           <w:szCs w:val="24"/>
           <w:lang w:val="en-US" w:bidi="fa-IR"/>
         </w:rPr>
-        <w:t xml:space="preserve">Institutional Pressures</w:t>
-      </w:r>
-      <w:r>
-        <w:rPr>
-          <w:rFonts w:ascii="Times New Roman" w:hAnsi="Times New Roman" w:cs="Arial" w:eastAsia="Times New Roman"/>
-          <w:b/>
-          <w:bCs/>
-          <w:i/>
-          <w:iCs/>
-          <w:sz w:val="28"/>
-          <w:szCs w:val="28"/>
-          <w:lang w:val="en-US" w:bidi="fa-IR"/>
-        </w:rPr>
-        <w:t xml:space="preserve">, </w:t>
-      </w:r>
-      <w:r>
-        <w:rPr>
-          <w:rFonts w:ascii="Times New Roman" w:hAnsi="Times New Roman" w:cs="Times New Roman" w:eastAsia="Times New Roman"/>
-          <w:b/>
-          <w:bCs/>
-          <w:i/>
-          <w:iCs/>
-          <w:sz w:val="24"/>
-          <w:szCs w:val="24"/>
-          <w:lang w:val="en-US" w:bidi="fa-IR"/>
-        </w:rPr>
-        <w:t xml:space="preserve">Information-System Maturity and the Accountability Effects of Public-Sector Financial Reforms</w:t>
+        <w:t xml:space="preserve">Institutional Pressures and Accountability in Public-Sector Financial Reforms</w:t>
       </w:r>
     </w:p>
     <w:p>

</xml_diff>